<commit_message>
[AI] Hardware Pipeline: receiver — P8c complete
Generated by Hardware Pipeline v2 on 2026-04-17 04:39 UTC.
Includes: device drivers, Qt GUI skeleton, SRS/SDD/HRS documents, compliance report, netlist, GLR spec, code review report.

🤖 Auto-committed by Hardware Pipeline AI
</commit_message>
<xml_diff>
--- a/.docx_cache/architecture.docx
+++ b/.docx_cache/architecture.docx
@@ -27,7 +27,7 @@
       <w:r>
         <w:drawing>
           <wp:inline xmlns:a="http://schemas.openxmlformats.org/drawingml/2006/main" xmlns:pic="http://schemas.openxmlformats.org/drawingml/2006/picture">
-            <wp:extent cx="5486400" cy="10442516"/>
+            <wp:extent cx="5486400" cy="4765330"/>
             <wp:docPr id="1" name="Picture 1"/>
             <wp:cNvGraphicFramePr>
               <a:graphicFrameLocks noChangeAspect="1"/>
@@ -48,7 +48,7 @@
                   <pic:spPr>
                     <a:xfrm>
                       <a:off x="0" y="0"/>
-                      <a:ext cx="5486400" cy="10442516"/>
+                      <a:ext cx="5486400" cy="4765330"/>
                     </a:xfrm>
                     <a:prstGeom prst="rect"/>
                   </pic:spPr>

</xml_diff>